<commit_message>
Add declarations section and test rows to D2 report
Fills in the Declarations and Error Reporting section, adds valid_declarations.scl and err_bad_type.scl to Table 2, and removes the folder-name TODO in How to Run.
</commit_message>
<xml_diff>
--- a/reports/D2_Parser_Report_Skeleton.docx
+++ b/reports/D2_Parser_Report_Skeleton.docx
@@ -1320,10 +1320,470 @@
           <w:rFonts w:ascii="Times New Roman" w:cs="Times New Roman" w:eastAsia="Times New Roman" w:hAnsi="Times New Roman"/>
           <w:sz w:val="24"/>
           <w:szCs w:val="24"/>
-          <w:highlight w:val="yellow"/>
-          <w:highlightCs w:val="yellow"/>
-        </w:rPr>
-        <w:t xml:space="preserve">[TODO: Half page by Kai. Cover: what declarations() does, the BNF rules, a short code excerpt, how duplicate defines are caught, and one valid and one invalid test. Code to describe in scl_parser.py: _declarations, _declaration, identifierExists, _check_declared, error, _synchronize.]</w:t>
+        </w:rPr>
+        <w:t xml:space="preserve">The variables part of main is a list of one or more define lines:</w:t>
+      </w:r>
+    </w:p>
+    <w:p>
+      <w:pPr>
+        <w:spacing w:after="0" w:line="220"/>
+      </w:pPr>
+      <w:r>
+        <w:rPr>
+          <w:rFonts w:ascii="Courier New" w:cs="Courier New" w:eastAsia="Courier New" w:hAnsi="Courier New"/>
+          <w:sz w:val="16"/>
+          <w:szCs w:val="16"/>
+        </w:rPr>
+        <w:t xml:space="preserve">&lt;declarations&gt; ::= &lt;declaration&gt; { &lt;declaration&gt; }</w:t>
+      </w:r>
+    </w:p>
+    <w:p>
+      <w:pPr>
+        <w:spacing w:after="0" w:line="220"/>
+      </w:pPr>
+      <w:r>
+        <w:rPr>
+          <w:rFonts w:ascii="Courier New" w:cs="Courier New" w:eastAsia="Courier New" w:hAnsi="Courier New"/>
+          <w:sz w:val="16"/>
+          <w:szCs w:val="16"/>
+        </w:rPr>
+        <w:t xml:space="preserve">&lt;declaration&gt;  ::= "define" IDENTIFIER "of" "type" &lt;type&gt;</w:t>
+      </w:r>
+    </w:p>
+    <w:p>
+      <w:pPr>
+        <w:spacing w:after="0" w:line="220"/>
+      </w:pPr>
+      <w:r>
+        <w:rPr>
+          <w:rFonts w:ascii="Courier New" w:cs="Courier New" w:eastAsia="Courier New" w:hAnsi="Courier New"/>
+          <w:sz w:val="16"/>
+          <w:szCs w:val="16"/>
+        </w:rPr>
+        <w:t xml:space="preserve">&lt;type&gt;         ::= "integer" | "real"</w:t>
+      </w:r>
+    </w:p>
+    <w:p>
+      <w:pPr>
+        <w:spacing w:after="120"/>
+      </w:pPr>
+    </w:p>
+    <w:p>
+      <w:pPr>
+        <w:spacing w:after="120"/>
+      </w:pPr>
+      <w:r>
+        <w:rPr>
+          <w:rFonts w:ascii="Times New Roman" w:cs="Times New Roman" w:eastAsia="Times New Roman" w:hAnsi="Times New Roman"/>
+          <w:sz w:val="24"/>
+          <w:szCs w:val="24"/>
+        </w:rPr>
+        <w:t xml:space="preserve">_declarations() parses one declaration and keeps calling _declaration() while the next token is define. _declaration() matches the tokens of one define in order and stops at the first one that does not fit. It then calls _synchronize() with define and begin as the only stopping points, so the parser skips the rest of the bad line and picks up at the next define or at the begin of the body. One bad define gives one error.</w:t>
+      </w:r>
+    </w:p>
+    <w:p>
+      <w:pPr>
+        <w:spacing w:after="0" w:line="220"/>
+      </w:pPr>
+      <w:r>
+        <w:rPr>
+          <w:rFonts w:ascii="Courier New" w:cs="Courier New" w:eastAsia="Courier New" w:hAnsi="Courier New"/>
+          <w:sz w:val="16"/>
+          <w:szCs w:val="16"/>
+        </w:rPr>
+        <w:t xml:space="preserve">errors_before = len(self._errors)</w:t>
+      </w:r>
+    </w:p>
+    <w:p>
+      <w:pPr>
+        <w:spacing w:after="0" w:line="220"/>
+      </w:pPr>
+      <w:r>
+        <w:rPr>
+          <w:rFonts w:ascii="Courier New" w:cs="Courier New" w:eastAsia="Courier New" w:hAnsi="Courier New"/>
+          <w:sz w:val="16"/>
+          <w:szCs w:val="16"/>
+        </w:rPr>
+        <w:t xml:space="preserve">tok = None</w:t>
+      </w:r>
+    </w:p>
+    <w:p>
+      <w:pPr>
+        <w:spacing w:after="0" w:line="220"/>
+      </w:pPr>
+      <w:r>
+        <w:rPr>
+          <w:rFonts w:ascii="Courier New" w:cs="Courier New" w:eastAsia="Courier New" w:hAnsi="Courier New"/>
+          <w:sz w:val="16"/>
+          <w:szCs w:val="16"/>
+        </w:rPr>
+        <w:t xml:space="preserve">if self.match("define"):</w:t>
+      </w:r>
+    </w:p>
+    <w:p>
+      <w:pPr>
+        <w:spacing w:after="0" w:line="220"/>
+      </w:pPr>
+      <w:r>
+        <w:rPr>
+          <w:rFonts w:ascii="Courier New" w:cs="Courier New" w:eastAsia="Courier New" w:hAnsi="Courier New"/>
+          <w:sz w:val="16"/>
+          <w:szCs w:val="16"/>
+        </w:rPr>
+        <w:t xml:space="preserve">    tok = self.match(IDENTIFIER)</w:t>
+      </w:r>
+    </w:p>
+    <w:p>
+      <w:pPr>
+        <w:spacing w:after="0" w:line="220"/>
+      </w:pPr>
+      <w:r>
+        <w:rPr>
+          <w:rFonts w:ascii="Courier New" w:cs="Courier New" w:eastAsia="Courier New" w:hAnsi="Courier New"/>
+          <w:sz w:val="16"/>
+          <w:szCs w:val="16"/>
+        </w:rPr>
+        <w:t xml:space="preserve">if tok and self.match("of") and self.match("type"):</w:t>
+      </w:r>
+    </w:p>
+    <w:p>
+      <w:pPr>
+        <w:spacing w:after="0" w:line="220"/>
+      </w:pPr>
+      <w:r>
+        <w:rPr>
+          <w:rFonts w:ascii="Courier New" w:cs="Courier New" w:eastAsia="Courier New" w:hAnsi="Courier New"/>
+          <w:sz w:val="16"/>
+          <w:szCs w:val="16"/>
+        </w:rPr>
+        <w:t xml:space="preserve">    type_name = self._type()</w:t>
+      </w:r>
+    </w:p>
+    <w:p>
+      <w:pPr>
+        <w:spacing w:after="0" w:line="220"/>
+      </w:pPr>
+      <w:r>
+        <w:rPr>
+          <w:rFonts w:ascii="Courier New" w:cs="Courier New" w:eastAsia="Courier New" w:hAnsi="Courier New"/>
+          <w:sz w:val="16"/>
+          <w:szCs w:val="16"/>
+        </w:rPr>
+        <w:t xml:space="preserve"/>
+      </w:r>
+    </w:p>
+    <w:p>
+      <w:pPr>
+        <w:spacing w:after="0" w:line="220"/>
+      </w:pPr>
+      <w:r>
+        <w:rPr>
+          <w:rFonts w:ascii="Courier New" w:cs="Courier New" w:eastAsia="Courier New" w:hAnsi="Courier New"/>
+          <w:sz w:val="16"/>
+          <w:szCs w:val="16"/>
+        </w:rPr>
+        <w:t xml:space="preserve">if len(self._errors) &gt; errors_before:</w:t>
+      </w:r>
+    </w:p>
+    <w:p>
+      <w:pPr>
+        <w:spacing w:after="0" w:line="220"/>
+      </w:pPr>
+      <w:r>
+        <w:rPr>
+          <w:rFonts w:ascii="Courier New" w:cs="Courier New" w:eastAsia="Courier New" w:hAnsi="Courier New"/>
+          <w:sz w:val="16"/>
+          <w:szCs w:val="16"/>
+        </w:rPr>
+        <w:t xml:space="preserve">    self._synchronize({_KW_DEFINE, _KW_BEGIN})</w:t>
+      </w:r>
+    </w:p>
+    <w:p>
+      <w:pPr>
+        <w:spacing w:after="0" w:line="220"/>
+      </w:pPr>
+      <w:r>
+        <w:rPr>
+          <w:rFonts w:ascii="Courier New" w:cs="Courier New" w:eastAsia="Courier New" w:hAnsi="Courier New"/>
+          <w:sz w:val="16"/>
+          <w:szCs w:val="16"/>
+        </w:rPr>
+        <w:t xml:space="preserve">    return</w:t>
+      </w:r>
+    </w:p>
+    <w:p>
+      <w:pPr>
+        <w:spacing w:after="0" w:line="220"/>
+      </w:pPr>
+      <w:r>
+        <w:rPr>
+          <w:rFonts w:ascii="Courier New" w:cs="Courier New" w:eastAsia="Courier New" w:hAnsi="Courier New"/>
+          <w:sz w:val="16"/>
+          <w:szCs w:val="16"/>
+        </w:rPr>
+        <w:t xml:space="preserve"/>
+      </w:r>
+    </w:p>
+    <w:p>
+      <w:pPr>
+        <w:spacing w:after="0" w:line="220"/>
+      </w:pPr>
+      <w:r>
+        <w:rPr>
+          <w:rFonts w:ascii="Courier New" w:cs="Courier New" w:eastAsia="Courier New" w:hAnsi="Courier New"/>
+          <w:sz w:val="16"/>
+          <w:szCs w:val="16"/>
+        </w:rPr>
+        <w:t xml:space="preserve">if tok.value in self._declared:</w:t>
+      </w:r>
+    </w:p>
+    <w:p>
+      <w:pPr>
+        <w:spacing w:after="0" w:line="220"/>
+      </w:pPr>
+      <w:r>
+        <w:rPr>
+          <w:rFonts w:ascii="Courier New" w:cs="Courier New" w:eastAsia="Courier New" w:hAnsi="Courier New"/>
+          <w:sz w:val="16"/>
+          <w:szCs w:val="16"/>
+        </w:rPr>
+        <w:t xml:space="preserve">    self._parse_error(</w:t>
+      </w:r>
+    </w:p>
+    <w:p>
+      <w:pPr>
+        <w:spacing w:after="0" w:line="220"/>
+      </w:pPr>
+      <w:r>
+        <w:rPr>
+          <w:rFonts w:ascii="Courier New" w:cs="Courier New" w:eastAsia="Courier New" w:hAnsi="Courier New"/>
+          <w:sz w:val="16"/>
+          <w:szCs w:val="16"/>
+        </w:rPr>
+        <w:t xml:space="preserve">        f"duplicate declaration of '{tok.value}'", tok.line</w:t>
+      </w:r>
+    </w:p>
+    <w:p>
+      <w:pPr>
+        <w:spacing w:after="0" w:line="220"/>
+      </w:pPr>
+      <w:r>
+        <w:rPr>
+          <w:rFonts w:ascii="Courier New" w:cs="Courier New" w:eastAsia="Courier New" w:hAnsi="Courier New"/>
+          <w:sz w:val="16"/>
+          <w:szCs w:val="16"/>
+        </w:rPr>
+        <w:t xml:space="preserve">    )</w:t>
+      </w:r>
+    </w:p>
+    <w:p>
+      <w:pPr>
+        <w:spacing w:after="120"/>
+      </w:pPr>
+    </w:p>
+    <w:p>
+      <w:pPr>
+        <w:spacing w:after="120"/>
+      </w:pPr>
+      <w:r>
+        <w:rPr>
+          <w:rFonts w:ascii="Times New Roman" w:cs="Times New Roman" w:eastAsia="Times New Roman" w:hAnsi="Times New Roman"/>
+          <w:sz w:val="24"/>
+          <w:szCs w:val="24"/>
+        </w:rPr>
+        <w:t xml:space="preserve">The parser keeps its own set of declared names, self._declared. When a define is complete, its name is looked up in the set. If it is already there the parser reports a duplicate declaration; otherwise the name is added and the define is printed as recognized. identifierExists(name) checks the same set, and _check_declared() calls it for every name used in set, input, or an expression, which is how an undeclared variable is reported. A define with a syntax error is never added to the set.</w:t>
+      </w:r>
+    </w:p>
+    <w:p>
+      <w:pPr>
+        <w:spacing w:after="120"/>
+      </w:pPr>
+      <w:r>
+        <w:rPr>
+          <w:rFonts w:ascii="Times New Roman" w:cs="Times New Roman" w:eastAsia="Times New Roman" w:hAnsi="Times New Roman"/>
+          <w:sz w:val="24"/>
+          <w:szCs w:val="24"/>
+        </w:rPr>
+        <w:t xml:space="preserve">Valid test, tests/valid_declarations.scl, declares two integers and two reals and uses all four in set, input, if, and display. The parser recognizes every statement and ends with "Parse completed successfully - no errors."</w:t>
+      </w:r>
+    </w:p>
+    <w:p>
+      <w:pPr>
+        <w:spacing w:after="120"/>
+      </w:pPr>
+      <w:r>
+        <w:rPr>
+          <w:rFonts w:ascii="Times New Roman" w:cs="Times New Roman" w:eastAsia="Times New Roman" w:hAnsi="Times New Roman"/>
+          <w:sz w:val="24"/>
+          <w:szCs w:val="24"/>
+        </w:rPr>
+        <w:t xml:space="preserve">Invalid test, tests/err_bad_type.scl, declares a variable of type string, which our subset does not have:</w:t>
+      </w:r>
+    </w:p>
+    <w:p>
+      <w:pPr>
+        <w:spacing w:after="0" w:line="220"/>
+      </w:pPr>
+      <w:r>
+        <w:rPr>
+          <w:rFonts w:ascii="Courier New" w:cs="Courier New" w:eastAsia="Courier New" w:hAnsi="Courier New"/>
+          <w:sz w:val="16"/>
+          <w:szCs w:val="16"/>
+        </w:rPr>
+        <w:t xml:space="preserve">define name of type string</w:t>
+      </w:r>
+    </w:p>
+    <w:p>
+      <w:pPr>
+        <w:spacing w:after="0" w:line="220"/>
+      </w:pPr>
+      <w:r>
+        <w:rPr>
+          <w:rFonts w:ascii="Courier New" w:cs="Courier New" w:eastAsia="Courier New" w:hAnsi="Courier New"/>
+          <w:sz w:val="16"/>
+          <w:szCs w:val="16"/>
+        </w:rPr>
+        <w:t xml:space="preserve">define size of type integer</w:t>
+      </w:r>
+    </w:p>
+    <w:p>
+      <w:pPr>
+        <w:spacing w:after="120"/>
+      </w:pPr>
+    </w:p>
+    <w:p>
+      <w:pPr>
+        <w:spacing w:after="120"/>
+      </w:pPr>
+      <w:r>
+        <w:rPr>
+          <w:rFonts w:ascii="Times New Roman" w:cs="Times New Roman" w:eastAsia="Times New Roman" w:hAnsi="Times New Roman"/>
+          <w:sz w:val="24"/>
+          <w:szCs w:val="24"/>
+        </w:rPr>
+        <w:t xml:space="preserve">Output:</w:t>
+      </w:r>
+    </w:p>
+    <w:p>
+      <w:pPr>
+        <w:spacing w:after="0" w:line="220"/>
+      </w:pPr>
+      <w:r>
+        <w:rPr>
+          <w:rFonts w:ascii="Courier New" w:cs="Courier New" w:eastAsia="Courier New" w:hAnsi="Courier New"/>
+          <w:sz w:val="16"/>
+          <w:szCs w:val="16"/>
+        </w:rPr>
+        <w:t xml:space="preserve">Statement recognized: import "stdio"</w:t>
+      </w:r>
+    </w:p>
+    <w:p>
+      <w:pPr>
+        <w:spacing w:after="0" w:line="220"/>
+      </w:pPr>
+      <w:r>
+        <w:rPr>
+          <w:rFonts w:ascii="Courier New" w:cs="Courier New" w:eastAsia="Courier New" w:hAnsi="Courier New"/>
+          <w:sz w:val="16"/>
+          <w:szCs w:val="16"/>
+        </w:rPr>
+        <w:t xml:space="preserve">Syntax error (line 7): expected type ('integer' or 'real'), found 'string'</w:t>
+      </w:r>
+    </w:p>
+    <w:p>
+      <w:pPr>
+        <w:spacing w:after="0" w:line="220"/>
+      </w:pPr>
+      <w:r>
+        <w:rPr>
+          <w:rFonts w:ascii="Courier New" w:cs="Courier New" w:eastAsia="Courier New" w:hAnsi="Courier New"/>
+          <w:sz w:val="16"/>
+          <w:szCs w:val="16"/>
+        </w:rPr>
+        <w:t xml:space="preserve">Statement recognized: define size of type integer</w:t>
+      </w:r>
+    </w:p>
+    <w:p>
+      <w:pPr>
+        <w:spacing w:after="0" w:line="220"/>
+      </w:pPr>
+      <w:r>
+        <w:rPr>
+          <w:rFonts w:ascii="Courier New" w:cs="Courier New" w:eastAsia="Courier New" w:hAnsi="Courier New"/>
+          <w:sz w:val="16"/>
+          <w:szCs w:val="16"/>
+        </w:rPr>
+        <w:t xml:space="preserve">Statement recognized (line 10): set size = 3</w:t>
+      </w:r>
+    </w:p>
+    <w:p>
+      <w:pPr>
+        <w:spacing w:after="0" w:line="220"/>
+      </w:pPr>
+      <w:r>
+        <w:rPr>
+          <w:rFonts w:ascii="Courier New" w:cs="Courier New" w:eastAsia="Courier New" w:hAnsi="Courier New"/>
+          <w:sz w:val="16"/>
+          <w:szCs w:val="16"/>
+        </w:rPr>
+        <w:t xml:space="preserve">Statement recognized (line 11): display size</w:t>
+      </w:r>
+    </w:p>
+    <w:p>
+      <w:pPr>
+        <w:spacing w:after="0" w:line="220"/>
+      </w:pPr>
+      <w:r>
+        <w:rPr>
+          <w:rFonts w:ascii="Courier New" w:cs="Courier New" w:eastAsia="Courier New" w:hAnsi="Courier New"/>
+          <w:sz w:val="16"/>
+          <w:szCs w:val="16"/>
+        </w:rPr>
+        <w:t xml:space="preserve">Statement recognized (line 12): exit</w:t>
+      </w:r>
+    </w:p>
+    <w:p>
+      <w:pPr>
+        <w:spacing w:after="0" w:line="220"/>
+      </w:pPr>
+      <w:r>
+        <w:rPr>
+          <w:rFonts w:ascii="Courier New" w:cs="Courier New" w:eastAsia="Courier New" w:hAnsi="Courier New"/>
+          <w:sz w:val="16"/>
+          <w:szCs w:val="16"/>
+        </w:rPr>
+        <w:t xml:space="preserve"/>
+      </w:r>
+    </w:p>
+    <w:p>
+      <w:pPr>
+        <w:spacing w:after="0" w:line="220"/>
+      </w:pPr>
+      <w:r>
+        <w:rPr>
+          <w:rFonts w:ascii="Courier New" w:cs="Courier New" w:eastAsia="Courier New" w:hAnsi="Courier New"/>
+          <w:sz w:val="16"/>
+          <w:szCs w:val="16"/>
+        </w:rPr>
+        <w:t xml:space="preserve">Parse finished with 1 error(s).</w:t>
+      </w:r>
+    </w:p>
+    <w:p>
+      <w:pPr>
+        <w:spacing w:after="120"/>
+      </w:pPr>
+    </w:p>
+    <w:p>
+      <w:pPr>
+        <w:spacing w:after="120"/>
+      </w:pPr>
+      <w:r>
+        <w:rPr>
+          <w:rFonts w:ascii="Times New Roman" w:cs="Times New Roman" w:eastAsia="Times New Roman" w:hAnsi="Times New Roman"/>
+          <w:sz w:val="24"/>
+          <w:szCs w:val="24"/>
+        </w:rPr>
+        <w:t xml:space="preserve">Before the recovery was added, the same file gave 5 errors: the real one, a false "expected 'begin', found 'string'", "expected a statement, found 'string'", and two "undeclared variable 'size'" errors, because the define of size on the next line was skipped. tests/err_dup.scl declares x twice and gives one error, "Syntax error (line 6): duplicate declaration of 'x'".</w:t>
       </w:r>
     </w:p>
     <w:p>
@@ -1557,17 +2017,7 @@
           <w:sz w:val="24"/>
           <w:szCs w:val="24"/>
         </w:rPr>
-        <w:t xml:space="preserve">The parser requires Python 3. The parser looks for the scanner in a folder named deliverable1_scanner next to the parser’s own folder, so the project folder should look like this </w:t>
-      </w:r>
-      <w:r>
-        <w:rPr>
-          <w:rFonts w:ascii="Times New Roman" w:cs="Times New Roman" w:eastAsia="Times New Roman" w:hAnsi="Times New Roman"/>
-          <w:sz w:val="24"/>
-          <w:szCs w:val="24"/>
-          <w:highlight w:val="yellow"/>
-          <w:highlightCs w:val="yellow"/>
-        </w:rPr>
-        <w:t xml:space="preserve">[TODO: confirm final folder names with Kai’s zip]</w:t>
+        <w:t xml:space="preserve">The parser requires Python 3. The parser looks for the scanner in a folder named deliverable1_scanner next to the parser’s own folder, so the project folder should look like this</w:t>
       </w:r>
       <w:r>
         <w:rPr>
@@ -2754,6 +3204,184 @@
             <w:r>
               <w:rPr>
                 <w:rFonts w:ascii="Times New Roman" w:cs="Times New Roman" w:eastAsia="Times New Roman" w:hAnsi="Times New Roman"/>
+                <w:b w:val="false"/>
+                <w:bCs w:val="false"/>
+                <w:sz w:val="20"/>
+                <w:szCs w:val="20"/>
+              </w:rPr>
+              <w:t xml:space="preserve">valid_declarations.scl</w:t>
+            </w:r>
+          </w:p>
+        </w:tc>
+        <w:tc>
+          <w:tcPr>
+            <w:tcW w:type="dxa" w:w="1000"/>
+            <w:tcBorders>
+              <w:top w:val="single" w:color="999999" w:sz="4"/>
+              <w:left w:val="single" w:color="999999" w:sz="4"/>
+              <w:bottom w:val="single" w:color="999999" w:sz="4"/>
+              <w:right w:val="single" w:color="999999" w:sz="4"/>
+            </w:tcBorders>
+            <w:tcMar>
+              <w:top w:type="dxa" w:w="60"/>
+              <w:left w:type="dxa" w:w="100"/>
+              <w:bottom w:type="dxa" w:w="60"/>
+              <w:right w:type="dxa" w:w="100"/>
+            </w:tcMar>
+          </w:tcPr>
+          <w:p>
+            <w:r>
+              <w:rPr>
+                <w:rFonts w:ascii="Times New Roman" w:cs="Times New Roman" w:eastAsia="Times New Roman" w:hAnsi="Times New Roman"/>
+                <w:b w:val="false"/>
+                <w:bCs w:val="false"/>
+                <w:sz w:val="20"/>
+                <w:szCs w:val="20"/>
+              </w:rPr>
+              <w:t xml:space="preserve">0</w:t>
+            </w:r>
+          </w:p>
+        </w:tc>
+        <w:tc>
+          <w:tcPr>
+            <w:tcW w:type="dxa" w:w="5760"/>
+            <w:tcBorders>
+              <w:top w:val="single" w:color="999999" w:sz="4"/>
+              <w:left w:val="single" w:color="999999" w:sz="4"/>
+              <w:bottom w:val="single" w:color="999999" w:sz="4"/>
+              <w:right w:val="single" w:color="999999" w:sz="4"/>
+            </w:tcBorders>
+            <w:tcMar>
+              <w:top w:type="dxa" w:w="60"/>
+              <w:left w:type="dxa" w:w="100"/>
+              <w:bottom w:type="dxa" w:w="60"/>
+              <w:right w:type="dxa" w:w="100"/>
+            </w:tcMar>
+          </w:tcPr>
+          <w:p>
+            <w:r>
+              <w:rPr>
+                <w:rFonts w:ascii="Times New Roman" w:cs="Times New Roman" w:eastAsia="Times New Roman" w:hAnsi="Times New Roman"/>
+                <w:b w:val="false"/>
+                <w:bCs w:val="false"/>
+                <w:sz w:val="20"/>
+                <w:szCs w:val="20"/>
+              </w:rPr>
+              <w:t xml:space="preserve">No errors. All four defines and every statement recognized.</w:t>
+            </w:r>
+          </w:p>
+        </w:tc>
+      </w:tr>
+      <w:tr>
+        <w:tc>
+          <w:tcPr>
+            <w:tcW w:type="dxa" w:w="2600"/>
+            <w:tcBorders>
+              <w:top w:val="single" w:color="999999" w:sz="4"/>
+              <w:left w:val="single" w:color="999999" w:sz="4"/>
+              <w:bottom w:val="single" w:color="999999" w:sz="4"/>
+              <w:right w:val="single" w:color="999999" w:sz="4"/>
+            </w:tcBorders>
+            <w:tcMar>
+              <w:top w:type="dxa" w:w="60"/>
+              <w:left w:type="dxa" w:w="100"/>
+              <w:bottom w:type="dxa" w:w="60"/>
+              <w:right w:type="dxa" w:w="100"/>
+            </w:tcMar>
+          </w:tcPr>
+          <w:p>
+            <w:r>
+              <w:rPr>
+                <w:rFonts w:ascii="Times New Roman" w:cs="Times New Roman" w:eastAsia="Times New Roman" w:hAnsi="Times New Roman"/>
+                <w:b w:val="false"/>
+                <w:bCs w:val="false"/>
+                <w:sz w:val="20"/>
+                <w:szCs w:val="20"/>
+              </w:rPr>
+              <w:t xml:space="preserve">err_bad_type.scl</w:t>
+            </w:r>
+          </w:p>
+        </w:tc>
+        <w:tc>
+          <w:tcPr>
+            <w:tcW w:type="dxa" w:w="1000"/>
+            <w:tcBorders>
+              <w:top w:val="single" w:color="999999" w:sz="4"/>
+              <w:left w:val="single" w:color="999999" w:sz="4"/>
+              <w:bottom w:val="single" w:color="999999" w:sz="4"/>
+              <w:right w:val="single" w:color="999999" w:sz="4"/>
+            </w:tcBorders>
+            <w:tcMar>
+              <w:top w:type="dxa" w:w="60"/>
+              <w:left w:type="dxa" w:w="100"/>
+              <w:bottom w:type="dxa" w:w="60"/>
+              <w:right w:type="dxa" w:w="100"/>
+            </w:tcMar>
+          </w:tcPr>
+          <w:p>
+            <w:r>
+              <w:rPr>
+                <w:rFonts w:ascii="Times New Roman" w:cs="Times New Roman" w:eastAsia="Times New Roman" w:hAnsi="Times New Roman"/>
+                <w:b w:val="false"/>
+                <w:bCs w:val="false"/>
+                <w:sz w:val="20"/>
+                <w:szCs w:val="20"/>
+              </w:rPr>
+              <w:t xml:space="preserve">1</w:t>
+            </w:r>
+          </w:p>
+        </w:tc>
+        <w:tc>
+          <w:tcPr>
+            <w:tcW w:type="dxa" w:w="5760"/>
+            <w:tcBorders>
+              <w:top w:val="single" w:color="999999" w:sz="4"/>
+              <w:left w:val="single" w:color="999999" w:sz="4"/>
+              <w:bottom w:val="single" w:color="999999" w:sz="4"/>
+              <w:right w:val="single" w:color="999999" w:sz="4"/>
+            </w:tcBorders>
+            <w:tcMar>
+              <w:top w:type="dxa" w:w="60"/>
+              <w:left w:type="dxa" w:w="100"/>
+              <w:bottom w:type="dxa" w:w="60"/>
+              <w:right w:type="dxa" w:w="100"/>
+            </w:tcMar>
+          </w:tcPr>
+          <w:p>
+            <w:r>
+              <w:rPr>
+                <w:rFonts w:ascii="Times New Roman" w:cs="Times New Roman" w:eastAsia="Times New Roman" w:hAnsi="Times New Roman"/>
+                <w:b w:val="false"/>
+                <w:bCs w:val="false"/>
+                <w:sz w:val="20"/>
+                <w:szCs w:val="20"/>
+              </w:rPr>
+              <w:t xml:space="preserve">Expected type ('integer' or 'real'), found 'string' (line 7). The define on line 8 still parses.</w:t>
+            </w:r>
+          </w:p>
+        </w:tc>
+      </w:tr>
+      <w:tr>
+        <w:tc>
+          <w:tcPr>
+            <w:tcW w:type="dxa" w:w="2600"/>
+            <w:tcBorders>
+              <w:top w:val="single" w:color="999999" w:sz="4"/>
+              <w:left w:val="single" w:color="999999" w:sz="4"/>
+              <w:bottom w:val="single" w:color="999999" w:sz="4"/>
+              <w:right w:val="single" w:color="999999" w:sz="4"/>
+            </w:tcBorders>
+            <w:tcMar>
+              <w:top w:type="dxa" w:w="60"/>
+              <w:left w:type="dxa" w:w="100"/>
+              <w:bottom w:type="dxa" w:w="60"/>
+              <w:right w:type="dxa" w:w="100"/>
+            </w:tcMar>
+          </w:tcPr>
+          <w:p>
+            <w:r>
+              <w:rPr>
+                <w:rFonts w:ascii="Times New Roman" w:cs="Times New Roman" w:eastAsia="Times New Roman" w:hAnsi="Times New Roman"/>
                 <w:sz w:val="20"/>
                 <w:szCs w:val="20"/>
                 <w:highlight w:val="yellow"/>

</xml_diff>